<commit_message>
fix: remove home address from Terms/Privacy Policy, email-only contact
The operator's personal address was in both legal documents and their
in-app pages. Removed it entirely per explicit request — contact for
legal notices, privacy requests, and DPDP grievances is now just
nvexis14@gmail.com, no postal address.

Co-Authored-By: Claude Sonnet 5 <noreply@anthropic.com>
Claude-Session: https://claude.ai/code/session_015m1k4VK6RLxjh2pe9zMdDP
</commit_message>
<xml_diff>
--- a/legal/Aurora-Privacy-Policy.docx
+++ b/legal/Aurora-Privacy-Policy.docx
@@ -65,7 +65,7 @@
     </w:p>
     <w:p>
       <w:r>
-        <w:t>Aurora is operated by Jai Akash, an individual sole proprietor trading as "Nvexis" ("we", "us", "our"), who is the data controller / data fiduciary for personal information processed through the Service. Contact: nvexis14@gmail.com. Postal: Jai Akash, No. 91, Maha Vishnu Nagar, Arakkonam Road, SS Nagar Post, Tiruttani – 631211, Tamil Nadu, India.</w:t>
+        <w:t>Aurora is operated by Jai Akash, an individual sole proprietor trading as "Nvexis" ("we", "us", "our"), who is the data controller / data fiduciary for personal information processed through the Service. Contact: nvexis14@gmail.com.</w:t>
       </w:r>
     </w:p>
     <w:p>
@@ -307,7 +307,7 @@
     </w:p>
     <w:p>
       <w:r>
-        <w:t>Privacy questions or requests: nvexis14@gmail.com. Grievance Officer (India, DPDP Act): Jai Akash, nvexis14@gmail.com. Postal: Jai Akash, No. 91, Maha Vishnu Nagar, Arakkonam Road, SS Nagar Post, Tiruttani – 631211, Tamil Nadu, India.</w:t>
+        <w:t>Privacy questions or requests: nvexis14@gmail.com. Grievance Officer (India, DPDP Act): Jai Akash, nvexis14@gmail.com.</w:t>
       </w:r>
     </w:p>
     <w:sectPr>

</xml_diff>